<commit_message>
Modifier le lab 13
</commit_message>
<xml_diff>
--- a/Lab 10/LAB 10 Créer un pipeline de données dans Azure Synapse Analytics.docx
+++ b/Lab 10/LAB 10 Créer un pipeline de données dans Azure Synapse Analytics.docx
@@ -215,6 +215,7 @@
         <w:rPr>
           <w:rFonts w:ascii="Segoe UI Semibold" w:hAnsi="Segoe UI Semibold" w:cs="Segoe UI Semibold"/>
           <w:color w:val="0D0D0D" w:themeColor="text1" w:themeTint="F2"/>
+          <w:lang w:val="en-US"/>
         </w:rPr>
       </w:pPr>
       <w:r>
@@ -223,187 +224,196 @@
           <w:color w:val="0D0D0D" w:themeColor="text1" w:themeTint="F2"/>
           <w:sz w:val="22"/>
           <w:szCs w:val="22"/>
+          <w:lang w:val="en-US"/>
         </w:rPr>
         <w:t xml:space="preserve">git clone </w:t>
       </w:r>
-      <w:hyperlink r:id="rId6" w:history="1">
-        <w:r>
-          <w:rPr>
-            <w:rStyle w:val="Hyperlink"/>
-            <w:rFonts w:ascii="Courier New" w:hAnsi="Courier New" w:cs="Courier New"/>
-            <w:sz w:val="22"/>
-            <w:szCs w:val="22"/>
-          </w:rPr>
-          <w:t>https://github.com/SBSsbs/Azure-Synapse-Analytics.git</w:t>
-        </w:r>
-      </w:hyperlink>
-      <w:r>
-        <w:rPr>
-          <w:rFonts w:ascii="Courier New" w:hAnsi="Courier New" w:cs="Courier New"/>
-          <w:color w:val="0D0D0D" w:themeColor="text1" w:themeTint="F2"/>
-          <w:sz w:val="22"/>
-          <w:szCs w:val="22"/>
-        </w:rPr>
-        <w:t xml:space="preserve"> synapse</w:t>
-      </w:r>
-    </w:p>
-    <w:p>
-      <w:pPr>
-        <w:pStyle w:val="NormalWeb"/>
-        <w:spacing w:before="0" w:beforeAutospacing="0" w:after="0" w:afterAutospacing="0"/>
-        <w:rPr>
-          <w:rFonts w:ascii="Courier New" w:hAnsi="Courier New" w:cs="Courier New"/>
-          <w:color w:val="0D0D0D" w:themeColor="text1" w:themeTint="F2"/>
-          <w:sz w:val="22"/>
-          <w:szCs w:val="22"/>
-        </w:rPr>
-      </w:pPr>
-    </w:p>
-    <w:p>
-      <w:pPr>
-        <w:pStyle w:val="NormalWeb"/>
-        <w:spacing w:before="0" w:beforeAutospacing="0" w:after="0" w:afterAutospacing="0"/>
-        <w:rPr>
-          <w:rFonts w:ascii="Courier New" w:hAnsi="Courier New" w:cs="Courier New"/>
-          <w:color w:val="0D0D0D" w:themeColor="text1" w:themeTint="F2"/>
-          <w:sz w:val="22"/>
-          <w:szCs w:val="22"/>
-        </w:rPr>
-      </w:pPr>
-    </w:p>
-    <w:p>
-      <w:pPr>
-        <w:pStyle w:val="NormalWeb"/>
-        <w:numPr>
-          <w:ilvl w:val="0"/>
-          <w:numId w:val="18"/>
-        </w:numPr>
-        <w:spacing w:before="0" w:beforeAutospacing="0" w:after="0" w:afterAutospacing="0"/>
-        <w:rPr>
-          <w:rFonts w:ascii="Segoe UI Semibold" w:hAnsi="Segoe UI Semibold" w:cs="Segoe UI Semibold"/>
-          <w:color w:val="0D0D0D" w:themeColor="text1" w:themeTint="F2"/>
-        </w:rPr>
-      </w:pPr>
-      <w:r>
-        <w:rPr>
-          <w:rFonts w:ascii="Segoe UI Semibold" w:hAnsi="Segoe UI Semibold" w:cs="Segoe UI Semibold"/>
-          <w:color w:val="0D0D0D" w:themeColor="text1" w:themeTint="F2"/>
-        </w:rPr>
-        <w:t>Une fois le référentiel cloné, saisissez les commandes suivantes pour accéder au dossier de cet exercice, puis exécutez le script setup.ps1 qu'il contient :</w:t>
-      </w:r>
-    </w:p>
-    <w:p>
-      <w:pPr>
-        <w:pStyle w:val="NormalWeb"/>
-        <w:spacing w:before="0" w:beforeAutospacing="0" w:after="0" w:afterAutospacing="0"/>
-        <w:rPr>
-          <w:rFonts w:ascii="Courier New" w:hAnsi="Courier New" w:cs="Courier New"/>
-          <w:color w:val="0D0D0D" w:themeColor="text1" w:themeTint="F2"/>
-          <w:sz w:val="22"/>
-          <w:szCs w:val="22"/>
-        </w:rPr>
-      </w:pPr>
-    </w:p>
-    <w:p>
-      <w:pPr>
-        <w:pStyle w:val="NormalWeb"/>
-        <w:spacing w:before="0" w:beforeAutospacing="0" w:after="0" w:afterAutospacing="0"/>
-        <w:rPr>
-          <w:rFonts w:ascii="Courier New" w:hAnsi="Courier New" w:cs="Courier New"/>
-          <w:color w:val="0D0D0D" w:themeColor="text1" w:themeTint="F2"/>
-          <w:sz w:val="22"/>
-          <w:szCs w:val="22"/>
-        </w:rPr>
-      </w:pPr>
-      <w:r>
-        <w:rPr>
+      <w:r>
+        <w:fldChar w:fldCharType="begin"/>
+      </w:r>
+      <w:r>
+        <w:rPr>
+          <w:lang w:val="en-US"/>
+        </w:rPr>
+        <w:instrText>HYPERLINK "https://github.com/SBSsbs/Azure-Synapse-Analytics.git"</w:instrText>
+      </w:r>
+      <w:r>
+        <w:fldChar w:fldCharType="separate"/>
+      </w:r>
+      <w:r>
+        <w:rPr>
+          <w:rStyle w:val="Hyperlink"/>
           <w:rFonts w:ascii="Courier New" w:hAnsi="Courier New" w:cs="Courier New"/>
           <w:sz w:val="22"/>
           <w:szCs w:val="22"/>
-        </w:rPr>
-        <w:t>cd './synapse/</w:t>
-      </w:r>
-      <w:proofErr w:type="spellStart"/>
+          <w:lang w:val="en-US"/>
+        </w:rPr>
+        <w:t>https://github.com/SBSsbs/Azure-Synapse-Analytics.git</w:t>
+      </w:r>
+      <w:r>
+        <w:fldChar w:fldCharType="end"/>
+      </w:r>
+      <w:r>
+        <w:rPr>
+          <w:rFonts w:ascii="Courier New" w:hAnsi="Courier New" w:cs="Courier New"/>
+          <w:color w:val="0D0D0D" w:themeColor="text1" w:themeTint="F2"/>
+          <w:sz w:val="22"/>
+          <w:szCs w:val="22"/>
+          <w:lang w:val="en-US"/>
+        </w:rPr>
+        <w:t xml:space="preserve"> synapse</w:t>
+      </w:r>
+    </w:p>
+    <w:p>
+      <w:pPr>
+        <w:pStyle w:val="NormalWeb"/>
+        <w:spacing w:before="0" w:beforeAutospacing="0" w:after="0" w:afterAutospacing="0"/>
+        <w:rPr>
+          <w:rFonts w:ascii="Courier New" w:hAnsi="Courier New" w:cs="Courier New"/>
+          <w:color w:val="0D0D0D" w:themeColor="text1" w:themeTint="F2"/>
+          <w:sz w:val="22"/>
+          <w:szCs w:val="22"/>
+          <w:lang w:val="en-US"/>
+        </w:rPr>
+      </w:pPr>
+    </w:p>
+    <w:p>
+      <w:pPr>
+        <w:pStyle w:val="NormalWeb"/>
+        <w:spacing w:before="0" w:beforeAutospacing="0" w:after="0" w:afterAutospacing="0"/>
+        <w:rPr>
+          <w:rFonts w:ascii="Courier New" w:hAnsi="Courier New" w:cs="Courier New"/>
+          <w:color w:val="0D0D0D" w:themeColor="text1" w:themeTint="F2"/>
+          <w:sz w:val="22"/>
+          <w:szCs w:val="22"/>
+          <w:lang w:val="en-US"/>
+        </w:rPr>
+      </w:pPr>
+    </w:p>
+    <w:p>
+      <w:pPr>
+        <w:pStyle w:val="NormalWeb"/>
+        <w:numPr>
+          <w:ilvl w:val="0"/>
+          <w:numId w:val="18"/>
+        </w:numPr>
+        <w:spacing w:before="0" w:beforeAutospacing="0" w:after="0" w:afterAutospacing="0"/>
+        <w:rPr>
+          <w:rFonts w:ascii="Segoe UI Semibold" w:hAnsi="Segoe UI Semibold" w:cs="Segoe UI Semibold"/>
+          <w:color w:val="0D0D0D" w:themeColor="text1" w:themeTint="F2"/>
+        </w:rPr>
+      </w:pPr>
+      <w:r>
+        <w:rPr>
+          <w:rFonts w:ascii="Segoe UI Semibold" w:hAnsi="Segoe UI Semibold" w:cs="Segoe UI Semibold"/>
+          <w:color w:val="0D0D0D" w:themeColor="text1" w:themeTint="F2"/>
+        </w:rPr>
+        <w:t>Une fois le référentiel cloné, saisissez les commandes suivantes pour accéder au dossier de cet exercice, puis exécutez le script setup.ps1 qu'il contient :</w:t>
+      </w:r>
+    </w:p>
+    <w:p>
+      <w:pPr>
+        <w:pStyle w:val="NormalWeb"/>
+        <w:spacing w:before="0" w:beforeAutospacing="0" w:after="0" w:afterAutospacing="0"/>
+        <w:rPr>
+          <w:rFonts w:ascii="Courier New" w:hAnsi="Courier New" w:cs="Courier New"/>
+          <w:color w:val="0D0D0D" w:themeColor="text1" w:themeTint="F2"/>
+          <w:sz w:val="22"/>
+          <w:szCs w:val="22"/>
+        </w:rPr>
+      </w:pPr>
+    </w:p>
+    <w:p>
+      <w:pPr>
+        <w:pStyle w:val="NormalWeb"/>
+        <w:spacing w:before="0" w:beforeAutospacing="0" w:after="0" w:afterAutospacing="0"/>
+        <w:rPr>
+          <w:rFonts w:ascii="Courier New" w:hAnsi="Courier New" w:cs="Courier New"/>
+          <w:color w:val="0D0D0D" w:themeColor="text1" w:themeTint="F2"/>
+          <w:sz w:val="22"/>
+          <w:szCs w:val="22"/>
+          <w:lang w:val="en-US"/>
+        </w:rPr>
+      </w:pPr>
       <w:r>
         <w:rPr>
           <w:rFonts w:ascii="Courier New" w:hAnsi="Courier New" w:cs="Courier New"/>
           <w:sz w:val="22"/>
           <w:szCs w:val="22"/>
-        </w:rPr>
-        <w:t>Lab</w:t>
-      </w:r>
-      <w:proofErr w:type="spellEnd"/>
+          <w:lang w:val="en-US"/>
+        </w:rPr>
+        <w:t xml:space="preserve">cd './synapse/Lab </w:t>
+      </w:r>
       <w:r>
         <w:rPr>
           <w:rFonts w:ascii="Courier New" w:hAnsi="Courier New" w:cs="Courier New"/>
           <w:sz w:val="22"/>
           <w:szCs w:val="22"/>
-        </w:rPr>
-        <w:t xml:space="preserve"> </w:t>
+          <w:lang w:val="en-US"/>
+        </w:rPr>
+        <w:t>10</w:t>
       </w:r>
       <w:r>
         <w:rPr>
           <w:rFonts w:ascii="Courier New" w:hAnsi="Courier New" w:cs="Courier New"/>
           <w:sz w:val="22"/>
           <w:szCs w:val="22"/>
-        </w:rPr>
-        <w:t>10</w:t>
+          <w:lang w:val="en-US"/>
+        </w:rPr>
+        <w:t>/</w:t>
       </w:r>
       <w:r>
         <w:rPr>
           <w:rFonts w:ascii="Courier New" w:hAnsi="Courier New" w:cs="Courier New"/>
           <w:sz w:val="22"/>
           <w:szCs w:val="22"/>
-        </w:rPr>
-        <w:t>/</w:t>
+          <w:lang w:val="en-US"/>
+        </w:rPr>
+        <w:t>10</w:t>
       </w:r>
       <w:r>
         <w:rPr>
           <w:rFonts w:ascii="Courier New" w:hAnsi="Courier New" w:cs="Courier New"/>
           <w:sz w:val="22"/>
           <w:szCs w:val="22"/>
-        </w:rPr>
-        <w:t>10</w:t>
-      </w:r>
-      <w:r>
+          <w:lang w:val="en-US"/>
+        </w:rPr>
+        <w:t>'</w:t>
+      </w:r>
+    </w:p>
+    <w:p>
+      <w:pPr>
+        <w:pStyle w:val="NormalWeb"/>
+        <w:spacing w:before="0" w:beforeAutospacing="0" w:after="0" w:afterAutospacing="0"/>
         <w:rPr>
           <w:rFonts w:ascii="Courier New" w:hAnsi="Courier New" w:cs="Courier New"/>
+          <w:color w:val="0D0D0D" w:themeColor="text1" w:themeTint="F2"/>
           <w:sz w:val="22"/>
           <w:szCs w:val="22"/>
-        </w:rPr>
-        <w:t>'</w:t>
-      </w:r>
-    </w:p>
-    <w:p>
-      <w:pPr>
-        <w:pStyle w:val="NormalWeb"/>
-        <w:spacing w:before="0" w:beforeAutospacing="0" w:after="0" w:afterAutospacing="0"/>
+          <w:lang w:val="en-US"/>
+        </w:rPr>
+      </w:pPr>
+      <w:r>
         <w:rPr>
           <w:rFonts w:ascii="Courier New" w:hAnsi="Courier New" w:cs="Courier New"/>
           <w:color w:val="0D0D0D" w:themeColor="text1" w:themeTint="F2"/>
           <w:sz w:val="22"/>
           <w:szCs w:val="22"/>
-        </w:rPr>
-      </w:pPr>
-      <w:r>
+          <w:lang w:val="en-US"/>
+        </w:rPr>
+        <w:t xml:space="preserve"> ./setup.ps1</w:t>
+      </w:r>
+    </w:p>
+    <w:p>
+      <w:pPr>
+        <w:pStyle w:val="NormalWeb"/>
+        <w:spacing w:before="0" w:beforeAutospacing="0" w:after="0" w:afterAutospacing="0"/>
         <w:rPr>
           <w:rFonts w:ascii="Courier New" w:hAnsi="Courier New" w:cs="Courier New"/>
           <w:color w:val="0D0D0D" w:themeColor="text1" w:themeTint="F2"/>
           <w:sz w:val="22"/>
           <w:szCs w:val="22"/>
-        </w:rPr>
-        <w:t xml:space="preserve"> ./setup.ps1</w:t>
-      </w:r>
-    </w:p>
-    <w:p>
-      <w:pPr>
-        <w:pStyle w:val="NormalWeb"/>
-        <w:spacing w:before="0" w:beforeAutospacing="0" w:after="0" w:afterAutospacing="0"/>
-        <w:rPr>
-          <w:rFonts w:ascii="Courier New" w:hAnsi="Courier New" w:cs="Courier New"/>
-          <w:color w:val="0D0D0D" w:themeColor="text1" w:themeTint="F2"/>
-          <w:sz w:val="22"/>
-          <w:szCs w:val="22"/>
+          <w:lang w:val="en-US"/>
         </w:rPr>
       </w:pPr>
     </w:p>
@@ -574,7 +584,7 @@
           <w:color w:val="0D0D0D" w:themeColor="text1" w:themeTint="F2"/>
         </w:rPr>
         <w:drawing>
-          <wp:inline distT="0" distB="0" distL="0" distR="0" wp14:anchorId="542DC753" wp14:editId="4414415D">
+          <wp:inline distT="0" distB="0" distL="0" distR="0" wp14:anchorId="542DC753" wp14:editId="62BB3058">
             <wp:extent cx="4221480" cy="2046524"/>
             <wp:effectExtent l="0" t="0" r="0" b="0"/>
             <wp:docPr id="1568557085" name="Picture 1"/>
@@ -589,7 +599,7 @@
                     <pic:cNvPicPr/>
                   </pic:nvPicPr>
                   <pic:blipFill>
-                    <a:blip r:embed="rId7" cstate="print">
+                    <a:blip r:embed="rId6" cstate="print">
                       <a:extLst>
                         <a:ext uri="{28A0092B-C50C-407E-A947-70E740481C1C}">
                           <a14:useLocalDpi xmlns:a14="http://schemas.microsoft.com/office/drawing/2010/main" val="0"/>
@@ -845,7 +855,7 @@
                     <pic:cNvPicPr/>
                   </pic:nvPicPr>
                   <pic:blipFill>
-                    <a:blip r:embed="rId8">
+                    <a:blip r:embed="rId7">
                       <a:extLst>
                         <a:ext uri="{28A0092B-C50C-407E-A947-70E740481C1C}">
                           <a14:useLocalDpi xmlns:a14="http://schemas.microsoft.com/office/drawing/2010/main" val="0"/>
@@ -1225,7 +1235,7 @@
                     <pic:cNvPicPr/>
                   </pic:nvPicPr>
                   <pic:blipFill>
-                    <a:blip r:embed="rId9">
+                    <a:blip r:embed="rId8">
                       <a:extLst>
                         <a:ext uri="{28A0092B-C50C-407E-A947-70E740481C1C}">
                           <a14:useLocalDpi xmlns:a14="http://schemas.microsoft.com/office/drawing/2010/main" val="0"/>
@@ -1332,7 +1342,7 @@
                     <pic:cNvPicPr/>
                   </pic:nvPicPr>
                   <pic:blipFill>
-                    <a:blip r:embed="rId10">
+                    <a:blip r:embed="rId9">
                       <a:extLst>
                         <a:ext uri="{28A0092B-C50C-407E-A947-70E740481C1C}">
                           <a14:useLocalDpi xmlns:a14="http://schemas.microsoft.com/office/drawing/2010/main" val="0"/>
@@ -1570,7 +1580,7 @@
                     <pic:cNvPicPr/>
                   </pic:nvPicPr>
                   <pic:blipFill>
-                    <a:blip r:embed="rId11">
+                    <a:blip r:embed="rId10">
                       <a:extLst>
                         <a:ext uri="{28A0092B-C50C-407E-A947-70E740481C1C}">
                           <a14:useLocalDpi xmlns:a14="http://schemas.microsoft.com/office/drawing/2010/main" val="0"/>
@@ -1842,7 +1852,7 @@
                     <pic:cNvPicPr/>
                   </pic:nvPicPr>
                   <pic:blipFill>
-                    <a:blip r:embed="rId12">
+                    <a:blip r:embed="rId11">
                       <a:extLst>
                         <a:ext uri="{28A0092B-C50C-407E-A947-70E740481C1C}">
                           <a14:useLocalDpi xmlns:a14="http://schemas.microsoft.com/office/drawing/2010/main" val="0"/>
@@ -2122,7 +2132,7 @@
                     <pic:cNvPicPr/>
                   </pic:nvPicPr>
                   <pic:blipFill>
-                    <a:blip r:embed="rId13">
+                    <a:blip r:embed="rId12">
                       <a:extLst>
                         <a:ext uri="{28A0092B-C50C-407E-A947-70E740481C1C}">
                           <a14:useLocalDpi xmlns:a14="http://schemas.microsoft.com/office/drawing/2010/main" val="0"/>
@@ -2531,7 +2541,7 @@
                     <pic:cNvPicPr/>
                   </pic:nvPicPr>
                   <pic:blipFill>
-                    <a:blip r:embed="rId14">
+                    <a:blip r:embed="rId13">
                       <a:extLst>
                         <a:ext uri="{28A0092B-C50C-407E-A947-70E740481C1C}">
                           <a14:useLocalDpi xmlns:a14="http://schemas.microsoft.com/office/drawing/2010/main" val="0"/>
@@ -2676,7 +2686,7 @@
                     <pic:cNvPicPr/>
                   </pic:nvPicPr>
                   <pic:blipFill>
-                    <a:blip r:embed="rId15">
+                    <a:blip r:embed="rId14">
                       <a:extLst>
                         <a:ext uri="{28A0092B-C50C-407E-A947-70E740481C1C}">
                           <a14:useLocalDpi xmlns:a14="http://schemas.microsoft.com/office/drawing/2010/main" val="0"/>
@@ -2803,7 +2813,7 @@
                     <pic:cNvPicPr/>
                   </pic:nvPicPr>
                   <pic:blipFill>
-                    <a:blip r:embed="rId16">
+                    <a:blip r:embed="rId15">
                       <a:extLst>
                         <a:ext uri="{28A0092B-C50C-407E-A947-70E740481C1C}">
                           <a14:useLocalDpi xmlns:a14="http://schemas.microsoft.com/office/drawing/2010/main" val="0"/>
@@ -2905,14 +2915,14 @@
       <w:r>
         <w:rPr>
           <w:rFonts w:ascii="Segoe UI Semibold" w:hAnsi="Segoe UI Semibold" w:cs="Segoe UI Semibold"/>
-          <w:color w:val="0D0D0D" w:themeColor="text1" w:themeTint="F2"/>
+          <w:color w:val="FF0000"/>
         </w:rPr>
         <w:t>D</w:t>
       </w:r>
       <w:r>
         <w:rPr>
           <w:rFonts w:ascii="Segoe UI Semibold" w:hAnsi="Segoe UI Semibold" w:cs="Segoe UI Semibold"/>
-          <w:color w:val="0D0D0D" w:themeColor="text1" w:themeTint="F2"/>
+          <w:color w:val="FF0000"/>
         </w:rPr>
         <w:t>onnées textuelles des produits</w:t>
       </w:r>
@@ -3045,7 +3055,7 @@
           <w:color w:val="0D0D0D" w:themeColor="text1" w:themeTint="F2"/>
         </w:rPr>
         <w:drawing>
-          <wp:inline distT="0" distB="0" distL="0" distR="0" wp14:anchorId="7F3747D7" wp14:editId="22C8F852">
+          <wp:inline distT="0" distB="0" distL="0" distR="0" wp14:anchorId="7F3747D7" wp14:editId="48E05F77">
             <wp:extent cx="2682240" cy="2084043"/>
             <wp:effectExtent l="0" t="0" r="0" b="0"/>
             <wp:docPr id="1891809358" name="Picture 11"/>
@@ -3060,7 +3070,7 @@
                     <pic:cNvPicPr/>
                   </pic:nvPicPr>
                   <pic:blipFill>
-                    <a:blip r:embed="rId17" cstate="print">
+                    <a:blip r:embed="rId16" cstate="print">
                       <a:extLst>
                         <a:ext uri="{28A0092B-C50C-407E-A947-70E740481C1C}">
                           <a14:useLocalDpi xmlns:a14="http://schemas.microsoft.com/office/drawing/2010/main" val="0"/>
@@ -3319,7 +3329,7 @@
                     <pic:cNvPicPr/>
                   </pic:nvPicPr>
                   <pic:blipFill>
-                    <a:blip r:embed="rId18">
+                    <a:blip r:embed="rId17">
                       <a:extLst>
                         <a:ext uri="{28A0092B-C50C-407E-A947-70E740481C1C}">
                           <a14:useLocalDpi xmlns:a14="http://schemas.microsoft.com/office/drawing/2010/main" val="0"/>
@@ -3575,7 +3585,7 @@
                     <pic:cNvPicPr/>
                   </pic:nvPicPr>
                   <pic:blipFill>
-                    <a:blip r:embed="rId19">
+                    <a:blip r:embed="rId18">
                       <a:extLst>
                         <a:ext uri="{28A0092B-C50C-407E-A947-70E740481C1C}">
                           <a14:useLocalDpi xmlns:a14="http://schemas.microsoft.com/office/drawing/2010/main" val="0"/>
@@ -3795,7 +3805,7 @@
                     <pic:cNvPicPr/>
                   </pic:nvPicPr>
                   <pic:blipFill>
-                    <a:blip r:embed="rId20">
+                    <a:blip r:embed="rId19">
                       <a:extLst>
                         <a:ext uri="{28A0092B-C50C-407E-A947-70E740481C1C}">
                           <a14:useLocalDpi xmlns:a14="http://schemas.microsoft.com/office/drawing/2010/main" val="0"/>
@@ -4190,7 +4200,7 @@
                     <pic:cNvPicPr/>
                   </pic:nvPicPr>
                   <pic:blipFill>
-                    <a:blip r:embed="rId21">
+                    <a:blip r:embed="rId20">
                       <a:extLst>
                         <a:ext uri="{28A0092B-C50C-407E-A947-70E740481C1C}">
                           <a14:useLocalDpi xmlns:a14="http://schemas.microsoft.com/office/drawing/2010/main" val="0"/>
@@ -4561,7 +4571,7 @@
                     <pic:cNvPicPr/>
                   </pic:nvPicPr>
                   <pic:blipFill>
-                    <a:blip r:embed="rId22">
+                    <a:blip r:embed="rId21">
                       <a:extLst>
                         <a:ext uri="{28A0092B-C50C-407E-A947-70E740481C1C}">
                           <a14:useLocalDpi xmlns:a14="http://schemas.microsoft.com/office/drawing/2010/main" val="0"/>
@@ -4713,7 +4723,7 @@
                     <pic:cNvPicPr/>
                   </pic:nvPicPr>
                   <pic:blipFill>
-                    <a:blip r:embed="rId23">
+                    <a:blip r:embed="rId22">
                       <a:extLst>
                         <a:ext uri="{28A0092B-C50C-407E-A947-70E740481C1C}">
                           <a14:useLocalDpi xmlns:a14="http://schemas.microsoft.com/office/drawing/2010/main" val="0"/>
@@ -5042,7 +5052,7 @@
                     <pic:cNvPicPr/>
                   </pic:nvPicPr>
                   <pic:blipFill>
-                    <a:blip r:embed="rId24">
+                    <a:blip r:embed="rId23">
                       <a:extLst>
                         <a:ext uri="{28A0092B-C50C-407E-A947-70E740481C1C}">
                           <a14:useLocalDpi xmlns:a14="http://schemas.microsoft.com/office/drawing/2010/main" val="0"/>
@@ -5120,7 +5130,7 @@
                     <pic:cNvPicPr/>
                   </pic:nvPicPr>
                   <pic:blipFill>
-                    <a:blip r:embed="rId25">
+                    <a:blip r:embed="rId24">
                       <a:extLst>
                         <a:ext uri="{28A0092B-C50C-407E-A947-70E740481C1C}">
                           <a14:useLocalDpi xmlns:a14="http://schemas.microsoft.com/office/drawing/2010/main" val="0"/>
@@ -5350,7 +5360,7 @@
                     <pic:cNvPicPr/>
                   </pic:nvPicPr>
                   <pic:blipFill>
-                    <a:blip r:embed="rId26">
+                    <a:blip r:embed="rId25">
                       <a:extLst>
                         <a:ext uri="{28A0092B-C50C-407E-A947-70E740481C1C}">
                           <a14:useLocalDpi xmlns:a14="http://schemas.microsoft.com/office/drawing/2010/main" val="0"/>
@@ -5721,7 +5731,7 @@
                     <pic:cNvPicPr/>
                   </pic:nvPicPr>
                   <pic:blipFill>
-                    <a:blip r:embed="rId27">
+                    <a:blip r:embed="rId26">
                       <a:extLst>
                         <a:ext uri="{28A0092B-C50C-407E-A947-70E740481C1C}">
                           <a14:useLocalDpi xmlns:a14="http://schemas.microsoft.com/office/drawing/2010/main" val="0"/>
@@ -5807,7 +5817,7 @@
                     <pic:cNvPicPr/>
                   </pic:nvPicPr>
                   <pic:blipFill>
-                    <a:blip r:embed="rId28">
+                    <a:blip r:embed="rId27">
                       <a:extLst>
                         <a:ext uri="{28A0092B-C50C-407E-A947-70E740481C1C}">
                           <a14:useLocalDpi xmlns:a14="http://schemas.microsoft.com/office/drawing/2010/main" val="0"/>
@@ -6037,7 +6047,7 @@
                     <pic:cNvPicPr/>
                   </pic:nvPicPr>
                   <pic:blipFill>
-                    <a:blip r:embed="rId29">
+                    <a:blip r:embed="rId28">
                       <a:extLst>
                         <a:ext uri="{28A0092B-C50C-407E-A947-70E740481C1C}">
                           <a14:useLocalDpi xmlns:a14="http://schemas.microsoft.com/office/drawing/2010/main" val="0"/>
@@ -6277,7 +6287,7 @@
         </w:rPr>
         <w:lastRenderedPageBreak/>
         <w:drawing>
-          <wp:inline distT="0" distB="0" distL="0" distR="0" wp14:anchorId="20030F24" wp14:editId="23AC150C">
+          <wp:inline distT="0" distB="0" distL="0" distR="0" wp14:anchorId="20030F24" wp14:editId="1780F269">
             <wp:extent cx="3787140" cy="1883134"/>
             <wp:effectExtent l="0" t="0" r="0" b="0"/>
             <wp:docPr id="1038854437" name="Picture 24"/>
@@ -6292,7 +6302,7 @@
                     <pic:cNvPicPr/>
                   </pic:nvPicPr>
                   <pic:blipFill>
-                    <a:blip r:embed="rId30" cstate="print">
+                    <a:blip r:embed="rId29" cstate="print">
                       <a:extLst>
                         <a:ext uri="{28A0092B-C50C-407E-A947-70E740481C1C}">
                           <a14:useLocalDpi xmlns:a14="http://schemas.microsoft.com/office/drawing/2010/main" val="0"/>
@@ -6509,7 +6519,7 @@
                     <pic:cNvPicPr/>
                   </pic:nvPicPr>
                   <pic:blipFill>
-                    <a:blip r:embed="rId31">
+                    <a:blip r:embed="rId30">
                       <a:extLst>
                         <a:ext uri="{28A0092B-C50C-407E-A947-70E740481C1C}">
                           <a14:useLocalDpi xmlns:a14="http://schemas.microsoft.com/office/drawing/2010/main" val="0"/>
@@ -6861,7 +6871,7 @@
         </w:rPr>
         <w:lastRenderedPageBreak/>
         <w:drawing>
-          <wp:inline distT="0" distB="0" distL="0" distR="0" wp14:anchorId="6846B162" wp14:editId="788BC791">
+          <wp:inline distT="0" distB="0" distL="0" distR="0" wp14:anchorId="6846B162" wp14:editId="1E64AE57">
             <wp:extent cx="3733800" cy="2075980"/>
             <wp:effectExtent l="0" t="0" r="0" b="0"/>
             <wp:docPr id="1859513840" name="Picture 26"/>
@@ -6876,7 +6886,7 @@
                     <pic:cNvPicPr/>
                   </pic:nvPicPr>
                   <pic:blipFill>
-                    <a:blip r:embed="rId32" cstate="print">
+                    <a:blip r:embed="rId31" cstate="print">
                       <a:extLst>
                         <a:ext uri="{28A0092B-C50C-407E-A947-70E740481C1C}">
                           <a14:useLocalDpi xmlns:a14="http://schemas.microsoft.com/office/drawing/2010/main" val="0"/>
@@ -7196,7 +7206,7 @@
                     <pic:cNvPicPr/>
                   </pic:nvPicPr>
                   <pic:blipFill>
-                    <a:blip r:embed="rId33">
+                    <a:blip r:embed="rId32">
                       <a:extLst>
                         <a:ext uri="{28A0092B-C50C-407E-A947-70E740481C1C}">
                           <a14:useLocalDpi xmlns:a14="http://schemas.microsoft.com/office/drawing/2010/main" val="0"/>
@@ -7419,7 +7429,7 @@
                     <pic:cNvPicPr/>
                   </pic:nvPicPr>
                   <pic:blipFill>
-                    <a:blip r:embed="rId34">
+                    <a:blip r:embed="rId33">
                       <a:extLst>
                         <a:ext uri="{28A0092B-C50C-407E-A947-70E740481C1C}">
                           <a14:useLocalDpi xmlns:a14="http://schemas.microsoft.com/office/drawing/2010/main" val="0"/>

</xml_diff>